<commit_message>
PR6: audit fixes (distractor origins, shuffled three-term item, caption wording, realistic distractors), audit md, README row
Co-Authored-By: Claude Opus 5.5 <noreply@anthropic.com>
Claude-Session: https://claude.ai/code/session_013Y8PfETWcMLvmUEpCdE8Wq
</commit_message>
<xml_diff>
--- a/support-materials/PR6/PR6_worked_examples.docx
+++ b/support-materials/PR6/PR6_worked_examples.docx
@@ -723,36 +723,6 @@
         <w:t xml:space="preserve">x</w:t>
       </w:r>
       <w:r>
-        <w:t xml:space="preserve">. Multiplying through by </w:t>
-      </w:r>
-      <w:r>
-        <w:rPr>
-          <w:i/>
-          <w:iCs/>
-        </w:rPr>
-        <w:t xml:space="preserve">4x</w:t>
-      </w:r>
-      <w:r>
-        <w:t xml:space="preserve"> gives </w:t>
-      </w:r>
-      <w:r>
-        <w:rPr>
-          <w:i/>
-          <w:iCs/>
-        </w:rPr>
-        <w:t xml:space="preserve">x−10=12x</w:t>
-      </w:r>
-      <w:r>
-        <w:t xml:space="preserve">, so </w:t>
-      </w:r>
-      <w:r>
-        <w:rPr>
-          <w:i/>
-          <w:iCs/>
-        </w:rPr>
-        <w:t xml:space="preserve">x=−10/11</w:t>
-      </w:r>
-      <w:r>
         <w:t xml:space="preserve">. </w:t>
       </w:r>
       <w:r>
@@ -987,17 +957,17 @@
         <w:t xml:space="preserve">2x</w:t>
       </w:r>
       <w:r>
-        <w:t xml:space="preserve"> multiplies only by </w:t>
-      </w:r>
-      <w:r>
-        <w:rPr>
-          <w:i/>
-          <w:iCs/>
-        </w:rPr>
-        <w:t xml:space="preserve">x</w:t>
-      </w:r>
-      <w:r>
-        <w:t xml:space="preserve">; and </w:t>
+        <w:t xml:space="preserve"> divides </w:t>
+      </w:r>
+      <w:r>
+        <w:rPr>
+          <w:i/>
+          <w:iCs/>
+        </w:rPr>
+        <w:t xml:space="preserve">6x</w:t>
+      </w:r>
+      <w:r>
+        <w:t xml:space="preserve"> by 3 but forgets to multiply by the 2; and </w:t>
       </w:r>
       <w:r>
         <w:rPr>
@@ -1742,7 +1712,17 @@
         <w:t xml:space="preserve">x=1</w:t>
       </w:r>
       <w:r>
-        <w:t xml:space="preserve"> comes from forgetting to multiply the 1 by the LCD; and −3 and −2 are the values </w:t>
+        <w:t xml:space="preserve"> comes from dropping the 1 and cross-multiplying, </w:t>
+      </w:r>
+      <w:r>
+        <w:rPr>
+          <w:i/>
+          <w:iCs/>
+        </w:rPr>
+        <w:t xml:space="preserve">(x+7)(x+2)=(x+5)(x+3)</w:t>
+      </w:r>
+      <w:r>
+        <w:t xml:space="preserve">; and −3 and −2 are the values </w:t>
       </w:r>
       <w:r>
         <w:rPr>
@@ -1808,7 +1788,7 @@
           <w:sz w:val="40"/>
           <w:szCs w:val="40"/>
         </w:rPr>
-        <w:t xml:space="preserve">(x−7)/(x+5)+1=(x−1)/(x+4)</w:t>
+        <w:t xml:space="preserve">1=(x−5)/(x+2)−(x−11)/(x+1)</w:t>
       </w:r>
     </w:p>
     <w:p>
@@ -1832,10 +1812,10 @@
           <w:i/>
           <w:iCs/>
         </w:rPr>
-        <w:t xml:space="preserve">(x+5)(x+4)</w:t>
-      </w:r>
-      <w:r>
-        <w:t xml:space="preserve"> and cancel. Which equation do you get?</w:t>
+        <w:t xml:space="preserve">(x+2)(x+1)</w:t>
+      </w:r>
+      <w:r>
+        <w:t xml:space="preserve"> and simplify the right side. Which equation do you get?</w:t>
       </w:r>
     </w:p>
     <w:p>
@@ -1855,7 +1835,22 @@
           <w:i/>
           <w:iCs/>
         </w:rPr>
-        <w:t xml:space="preserve">(x−7)(x+4)+1=(x−1)(x+5)</w:t>
+        <w:t xml:space="preserve">x</w:t>
+      </w:r>
+      <w:r>
+        <w:rPr>
+          <w:i/>
+          <w:iCs/>
+          <w:vertAlign w:val="superscript"/>
+        </w:rPr>
+        <w:t xml:space="preserve">2</w:t>
+      </w:r>
+      <w:r>
+        <w:rPr>
+          <w:i/>
+          <w:iCs/>
+        </w:rPr>
+        <w:t xml:space="preserve">+3x+2=−13x−27</w:t>
       </w:r>
     </w:p>
     <w:p>
@@ -1875,7 +1870,7 @@
           <w:i/>
           <w:iCs/>
         </w:rPr>
-        <w:t xml:space="preserve">(x−7)(x+4)+(x+5)(x+4)=(x−1)(x+5)</w:t>
+        <w:t xml:space="preserve">1=5x+17</w:t>
       </w:r>
     </w:p>
     <w:p>
@@ -1895,7 +1890,22 @@
           <w:i/>
           <w:iCs/>
         </w:rPr>
-        <w:t xml:space="preserve">(x−7)(x+5)+(x+5)(x+4)=(x−1)(x+4)</w:t>
+        <w:t xml:space="preserve">x</w:t>
+      </w:r>
+      <w:r>
+        <w:rPr>
+          <w:i/>
+          <w:iCs/>
+          <w:vertAlign w:val="superscript"/>
+        </w:rPr>
+        <w:t xml:space="preserve">2</w:t>
+      </w:r>
+      <w:r>
+        <w:rPr>
+          <w:i/>
+          <w:iCs/>
+        </w:rPr>
+        <w:t xml:space="preserve">+3x+2=5x+17</w:t>
       </w:r>
     </w:p>
     <w:p>
@@ -1915,7 +1925,37 @@
           <w:i/>
           <w:iCs/>
         </w:rPr>
-        <w:t xml:space="preserve">(x−7)+(x+5)(x+4)=(x−1)</w:t>
+        <w:t xml:space="preserve">x</w:t>
+      </w:r>
+      <w:r>
+        <w:rPr>
+          <w:i/>
+          <w:iCs/>
+          <w:vertAlign w:val="superscript"/>
+        </w:rPr>
+        <w:t xml:space="preserve">2</w:t>
+      </w:r>
+      <w:r>
+        <w:rPr>
+          <w:i/>
+          <w:iCs/>
+        </w:rPr>
+        <w:t xml:space="preserve">+3x+2=2x</w:t>
+      </w:r>
+      <w:r>
+        <w:rPr>
+          <w:i/>
+          <w:iCs/>
+          <w:vertAlign w:val="superscript"/>
+        </w:rPr>
+        <w:t xml:space="preserve">2</w:t>
+      </w:r>
+      <w:r>
+        <w:rPr>
+          <w:i/>
+          <w:iCs/>
+        </w:rPr>
+        <w:t xml:space="preserve">−13x−27</w:t>
       </w:r>
     </w:p>
     <w:p>
@@ -1932,47 +1972,72 @@
         <w:spacing w:after="120" w:before="80" w:line="300"/>
       </w:pPr>
       <w:r>
-        <w:t xml:space="preserve">Each fraction keeps the factor its own denominator does not cancel: </w:t>
-      </w:r>
-      <w:r>
-        <w:rPr>
-          <w:i/>
-          <w:iCs/>
-        </w:rPr>
-        <w:t xml:space="preserve">(x−7)/(x+5)</w:t>
-      </w:r>
-      <w:r>
-        <w:t xml:space="preserve"> keeps </w:t>
-      </w:r>
-      <w:r>
-        <w:rPr>
-          <w:i/>
-          <w:iCs/>
-        </w:rPr>
-        <w:t xml:space="preserve">(x+4)</w:t>
-      </w:r>
-      <w:r>
-        <w:t xml:space="preserve">, the 1 gets both factors, and </w:t>
-      </w:r>
-      <w:r>
-        <w:rPr>
-          <w:i/>
-          <w:iCs/>
-        </w:rPr>
-        <w:t xml:space="preserve">(x−1)/(x+4)</w:t>
-      </w:r>
-      <w:r>
-        <w:t xml:space="preserve"> keeps </w:t>
-      </w:r>
-      <w:r>
-        <w:rPr>
-          <w:i/>
-          <w:iCs/>
-        </w:rPr>
-        <w:t xml:space="preserve">(x+5)</w:t>
-      </w:r>
-      <w:r>
-        <w:t xml:space="preserve">. Expanding gives </w:t>
+        <w:t xml:space="preserve">The 1 becomes </w:t>
+      </w:r>
+      <w:r>
+        <w:rPr>
+          <w:i/>
+          <w:iCs/>
+        </w:rPr>
+        <w:t xml:space="preserve">(x+2)(x+1)=x</w:t>
+      </w:r>
+      <w:r>
+        <w:rPr>
+          <w:i/>
+          <w:iCs/>
+          <w:vertAlign w:val="superscript"/>
+        </w:rPr>
+        <w:t xml:space="preserve">2</w:t>
+      </w:r>
+      <w:r>
+        <w:rPr>
+          <w:i/>
+          <w:iCs/>
+        </w:rPr>
+        <w:t xml:space="preserve">+3x+2</w:t>
+      </w:r>
+      <w:r>
+        <w:t xml:space="preserve">. On the right, each fraction keeps the factor its own denominator does not cancel, and the minus in front of the second fraction belongs to its whole product: </w:t>
+      </w:r>
+      <w:r>
+        <w:rPr>
+          <w:i/>
+          <w:iCs/>
+        </w:rPr>
+        <w:t xml:space="preserve">(x−5)(x+1)−(x−11)(x+2)=(x</w:t>
+      </w:r>
+      <w:r>
+        <w:rPr>
+          <w:i/>
+          <w:iCs/>
+          <w:vertAlign w:val="superscript"/>
+        </w:rPr>
+        <w:t xml:space="preserve">2</w:t>
+      </w:r>
+      <w:r>
+        <w:rPr>
+          <w:i/>
+          <w:iCs/>
+        </w:rPr>
+        <w:t xml:space="preserve">−4x−5)−(x</w:t>
+      </w:r>
+      <w:r>
+        <w:rPr>
+          <w:i/>
+          <w:iCs/>
+          <w:vertAlign w:val="superscript"/>
+        </w:rPr>
+        <w:t xml:space="preserve">2</w:t>
+      </w:r>
+      <w:r>
+        <w:rPr>
+          <w:i/>
+          <w:iCs/>
+        </w:rPr>
+        <w:t xml:space="preserve">−9x−22)=5x+17</w:t>
+      </w:r>
+      <w:r>
+        <w:t xml:space="preserve">. So </w:t>
       </w:r>
       <w:r>
         <w:rPr>
@@ -1994,17 +2059,17 @@
           <w:i/>
           <w:iCs/>
         </w:rPr>
-        <w:t xml:space="preserve">+2x−3=0</w:t>
-      </w:r>
-      <w:r>
-        <w:t xml:space="preserve">, so </w:t>
-      </w:r>
-      <w:r>
-        <w:rPr>
-          <w:i/>
-          <w:iCs/>
-        </w:rPr>
-        <w:t xml:space="preserve">(x+3)(x−1)=0</w:t>
+        <w:t xml:space="preserve">−2x−15=0</w:t>
+      </w:r>
+      <w:r>
+        <w:t xml:space="preserve">, </w:t>
+      </w:r>
+      <w:r>
+        <w:rPr>
+          <w:i/>
+          <w:iCs/>
+        </w:rPr>
+        <w:t xml:space="preserve">(x−5)(x+3)=0</w:t>
       </w:r>
       <w:r>
         <w:t xml:space="preserve">, and </w:t>
@@ -2014,49 +2079,111 @@
           <w:i/>
           <w:iCs/>
         </w:rPr>
+        <w:t xml:space="preserve">x=5</w:t>
+      </w:r>
+      <w:r>
+        <w:t xml:space="preserve"> or </w:t>
+      </w:r>
+      <w:r>
+        <w:rPr>
+          <w:i/>
+          <w:iCs/>
+        </w:rPr>
         <w:t xml:space="preserve">x=−3</w:t>
       </w:r>
       <w:r>
-        <w:t xml:space="preserve"> or </w:t>
-      </w:r>
-      <w:r>
-        <w:rPr>
-          <w:i/>
-          <w:iCs/>
-        </w:rPr>
-        <w:t xml:space="preserve">x=1</w:t>
-      </w:r>
-      <w:r>
-        <w:t xml:space="preserve">, neither one off limits. Writing </w:t>
-      </w:r>
-      <w:r>
-        <w:rPr>
-          <w:i/>
-          <w:iCs/>
-        </w:rPr>
-        <w:t xml:space="preserve">+1</w:t>
-      </w:r>
-      <w:r>
-        <w:t xml:space="preserve"> forgets to multiply the 1; the version with </w:t>
-      </w:r>
-      <w:r>
-        <w:rPr>
-          <w:i/>
-          <w:iCs/>
-        </w:rPr>
-        <w:t xml:space="preserve">(x−7)(x+5)</w:t>
-      </w:r>
-      <w:r>
-        <w:t xml:space="preserve"> multiplies by the factor that should cancel; and dropping the factors on the fractions cancels too much. </w:t>
-      </w:r>
-      <w:r>
-        <w:rPr>
-          <w:b/>
-          <w:bCs/>
-          <w:i/>
-          <w:iCs/>
-        </w:rPr>
-        <w:t xml:space="preserve">(x−7)(x+4)+(x+5)(x+4)=(x−1)(x+5)</w:t>
+        <w:t xml:space="preserve">, neither one −2 or −1. </w:t>
+      </w:r>
+      <w:r>
+        <w:rPr>
+          <w:i/>
+          <w:iCs/>
+        </w:rPr>
+        <w:t xml:space="preserve">−13x−27</w:t>
+      </w:r>
+      <w:r>
+        <w:t xml:space="preserve"> subtracts only the </w:t>
+      </w:r>
+      <w:r>
+        <w:rPr>
+          <w:i/>
+          <w:iCs/>
+        </w:rPr>
+        <w:t xml:space="preserve">x</w:t>
+      </w:r>
+      <w:r>
+        <w:rPr>
+          <w:i/>
+          <w:iCs/>
+          <w:vertAlign w:val="superscript"/>
+        </w:rPr>
+        <w:t xml:space="preserve">2</w:t>
+      </w:r>
+      <w:r>
+        <w:t xml:space="preserve">; </w:t>
+      </w:r>
+      <w:r>
+        <w:rPr>
+          <w:i/>
+          <w:iCs/>
+        </w:rPr>
+        <w:t xml:space="preserve">1=5x+17</w:t>
+      </w:r>
+      <w:r>
+        <w:t xml:space="preserve"> forgets to multiply the 1; and </w:t>
+      </w:r>
+      <w:r>
+        <w:rPr>
+          <w:i/>
+          <w:iCs/>
+        </w:rPr>
+        <w:t xml:space="preserve">2x</w:t>
+      </w:r>
+      <w:r>
+        <w:rPr>
+          <w:i/>
+          <w:iCs/>
+          <w:vertAlign w:val="superscript"/>
+        </w:rPr>
+        <w:t xml:space="preserve">2</w:t>
+      </w:r>
+      <w:r>
+        <w:rPr>
+          <w:i/>
+          <w:iCs/>
+        </w:rPr>
+        <w:t xml:space="preserve">−13x−27</w:t>
+      </w:r>
+      <w:r>
+        <w:t xml:space="preserve"> adds the products instead of subtracting. </w:t>
+      </w:r>
+      <w:r>
+        <w:rPr>
+          <w:b/>
+          <w:bCs/>
+          <w:i/>
+          <w:iCs/>
+        </w:rPr>
+        <w:t xml:space="preserve">x</w:t>
+      </w:r>
+      <w:r>
+        <w:rPr>
+          <w:b/>
+          <w:bCs/>
+          <w:i/>
+          <w:iCs/>
+          <w:vertAlign w:val="superscript"/>
+        </w:rPr>
+        <w:t xml:space="preserve">2</w:t>
+      </w:r>
+      <w:r>
+        <w:rPr>
+          <w:b/>
+          <w:bCs/>
+          <w:i/>
+          <w:iCs/>
+        </w:rPr>
+        <w:t xml:space="preserve">+3x+2=5x+17</w:t>
       </w:r>
       <w:r>
         <w:rPr>
@@ -2084,7 +2211,7 @@
           <wp:inline distT="0" distB="0" distL="0" distR="0">
             <wp:extent cx="3086100" cy="2476500"/>
             <wp:effectExtent t="0" r="0" b="0" l="0"/>
-            <wp:docPr id="1" name="xs1" descr="The graph of the left side of a rational equation. Plotted data: The graph of y = 1 + 8/(x − 4) + 8/((x − 4)(x − 5)), on axes with x from −6 to 10 and y from −12 to 12. There is a dashed vertical asymptote at x = 5. Left of it, the curve comes in just below y = 1 from the left, crosses the x-axis at (−3, 0), which is marked, then drops faster and faster toward the asymptote. On the way down there is an open circle at (4, −7): the curve has a gap there. Right of the asymptote the curve comes down from the top and levels off toward y = 1." title="The graph of the left side of a rational equation"/>
+            <wp:docPr id="1" name="xs1" descr="The graph of the left side of a rational equation. Plotted data: The graph of y = 1 + 8/(x − 4) + 8/((x − 4)(x − 5)), on axes with x from −6 to 10 and y from −12 to 12. There is a dashed vertical asymptote at x = 5. Left of it, the curve comes in just below y = 1 from the left, crosses the x-axis at (−3, 0), which is marked, then drops faster and faster toward the asymptote. On the way down there is an open circle at (4, −7). Right of the asymptote the curve comes down from the top and levels off toward y = 1." title="The graph of the left side of a rational equation"/>
             <wp:cNvGraphicFramePr>
               <a:graphicFrameLocks xmlns:a="http://schemas.openxmlformats.org/drawingml/2006/main" noChangeAspect="1"/>
             </wp:cNvGraphicFramePr>
@@ -2138,7 +2265,7 @@
           <w:sz w:val="22"/>
           <w:szCs w:val="22"/>
         </w:rPr>
-        <w:t xml:space="preserve">The graph of y = 1 + 8/(x − 4) + 8/((x − 4)(x − 5)), on axes with x from −6 to 10 and y from −12 to 12. There is a dashed vertical asymptote at x = 5. Left of it, the curve comes in just below y = 1 from the left, crosses the x-axis at (−3, 0), which is marked, then drops faster and faster toward the asymptote. On the way down there is an open circle at (4, −7): the curve has a gap there. Right of the asymptote the curve comes down from the top and levels off toward y = 1.</w:t>
+        <w:t xml:space="preserve">The graph of y = 1 + 8/(x − 4) + 8/((x − 4)(x − 5)), on axes with x from −6 to 10 and y from −12 to 12. There is a dashed vertical asymptote at x = 5. Left of it, the curve comes in just below y = 1 from the left, crosses the x-axis at (−3, 0), which is marked, then drops faster and faster toward the asymptote. On the way down there is an open circle at (4, −7). Right of the asymptote the curve comes down from the top and levels off toward y = 1.</w:t>
       </w:r>
     </w:p>
     <w:p>
@@ -2196,7 +2323,7 @@
         <w:t xml:space="preserve">A.  </w:t>
       </w:r>
       <w:r>
-        <w:t xml:space="preserve">The graph has a gap there: the left side is undefined at 4.</w:t>
+        <w:t xml:space="preserve">The left side is undefined at 4, so that point is missing.</w:t>
       </w:r>
     </w:p>
     <w:p>
@@ -2395,7 +2522,7 @@
         <w:t xml:space="preserve">(x+5)(x−4)=0</w:t>
       </w:r>
       <w:r>
-        <w:t xml:space="preserve">. Which candidate has to be thrown out?</w:t>
+        <w:t xml:space="preserve">. Which candidate, if either, has to be thrown out?</w:t>
       </w:r>
     </w:p>
     <w:p>
@@ -2411,7 +2538,7 @@
         <w:t xml:space="preserve">A.  </w:t>
       </w:r>
       <w:r>
-        <w:t xml:space="preserve">4, since 4 is positive and the others are negative</w:t>
+        <w:t xml:space="preserve">4, since 4 is positive and −5 is negative</w:t>
       </w:r>
     </w:p>
     <w:p>
@@ -2427,7 +2554,7 @@
         <w:t xml:space="preserve">B.  </w:t>
       </w:r>
       <w:r>
-        <w:t xml:space="preserve">Neither; x = −5 and x = 4 both solve it</w:t>
+        <w:t xml:space="preserve">Neither, since x = −5 and x = 4 both solve the cleared equation</w:t>
       </w:r>
     </w:p>
     <w:p>
@@ -2459,7 +2586,7 @@
         <w:t xml:space="preserve">D.  </w:t>
       </w:r>
       <w:r>
-        <w:t xml:space="preserve">4, since 4 makes x − 2 positive, not 0</w:t>
+        <w:t xml:space="preserve">4, since 4 makes the factor x − 4 equal 0</w:t>
       </w:r>
     </w:p>
     <w:p>
@@ -2526,17 +2653,27 @@
         <w:t xml:space="preserve">1−2/9−14/18=0</w:t>
       </w:r>
       <w:r>
-        <w:t xml:space="preserve">. Being positive or negative has nothing to do with it, and solving the cleared equation is not enough to count. Whether </w:t>
-      </w:r>
-      <w:r>
-        <w:rPr>
-          <w:i/>
-          <w:iCs/>
-        </w:rPr>
-        <w:t xml:space="preserve">x−2</w:t>
-      </w:r>
-      <w:r>
-        <w:t xml:space="preserve"> is positive at 4 does not matter; only a 0 denominator rules a value out. </w:t>
+        <w:t xml:space="preserve">. Being positive or negative has nothing to do with it, and solving the cleared equation is not enough to count. 4 does make </w:t>
+      </w:r>
+      <w:r>
+        <w:rPr>
+          <w:i/>
+          <w:iCs/>
+        </w:rPr>
+        <w:t xml:space="preserve">x−4=0</w:t>
+      </w:r>
+      <w:r>
+        <w:t xml:space="preserve">, but that is why it is a candidate; </w:t>
+      </w:r>
+      <w:r>
+        <w:rPr>
+          <w:i/>
+          <w:iCs/>
+        </w:rPr>
+        <w:t xml:space="preserve">x−4</w:t>
+      </w:r>
+      <w:r>
+        <w:t xml:space="preserve"> is in no denominator. Only a 0 denominator rules a value out. </w:t>
       </w:r>
       <w:r>
         <w:rPr>
@@ -3171,17 +3308,7 @@
         <w:t xml:space="preserve">5x</w:t>
       </w:r>
       <w:r>
-        <w:t xml:space="preserve"> is already the least common denominator, and </w:t>
-      </w:r>
-      <w:r>
-        <w:rPr>
-          <w:i/>
-          <w:iCs/>
-        </w:rPr>
-        <w:t xml:space="preserve">x=8</w:t>
-      </w:r>
-      <w:r>
-        <w:t xml:space="preserve"> is wrong for a different reason: it does not make any denominator 0. </w:t>
+        <w:t xml:space="preserve"> is already the least common denominator, and 8 is wrong only because the 2 was skipped; it does not make any denominator 0. </w:t>
       </w:r>
       <w:r>
         <w:rPr>
@@ -3771,10 +3898,20 @@
           <w:i/>
           <w:iCs/>
         </w:rPr>
-        <w:t xml:space="preserve">13/(−1.5−5)=13/(−6.5)=−2</w:t>
-      </w:r>
-      <w:r>
-        <w:t xml:space="preserve">. CheckIt wants fractions, not decimals. </w:t>
+        <w:t xml:space="preserve">13/(−3/2−5)=13/(−13/2)=−2</w:t>
+      </w:r>
+      <w:r>
+        <w:t xml:space="preserve">. −2 times −5 is </w:t>
+      </w:r>
+      <w:r>
+        <w:rPr>
+          <w:i/>
+          <w:iCs/>
+        </w:rPr>
+        <w:t xml:space="preserve">+10</w:t>
+      </w:r>
+      <w:r>
+        <w:t xml:space="preserve">, not −10, so the distributing was right, and CheckIt wants fractions, not decimals. </w:t>
       </w:r>
       <w:r>
         <w:rPr>
@@ -4224,7 +4361,7 @@
           <w:i/>
           <w:iCs/>
         </w:rPr>
-        <w:t xml:space="preserve">+12x</w:t>
+        <w:t xml:space="preserve">22x+12x</w:t>
       </w:r>
       <w:r>
         <w:t xml:space="preserve"> and </w:t>
@@ -4234,7 +4371,7 @@
           <w:i/>
           <w:iCs/>
         </w:rPr>
-        <w:t xml:space="preserve">+35</w:t>
+        <w:t xml:space="preserve">56+35</w:t>
       </w:r>
       <w:r>
         <w:t xml:space="preserve">. So </w:t>
@@ -4272,7 +4409,7 @@
         <w:t xml:space="preserve">(x+3)(x+7)=0</w:t>
       </w:r>
       <w:r>
-        <w:t xml:space="preserve">, and neither −3 nor −7 is off limits, since those are −5 and −4. The right side cannot just be dropped. And a quadratic that does not factor can still have solutions, from the quadratic formula; here the trouble is the setup, not the factoring. </w:t>
+        <w:t xml:space="preserve">, and neither −3 nor −7 is off limits, since the off-limits values are −5 and −4. The right side cannot just be dropped. And a quadratic that does not factor can still have solutions, from the quadratic formula; here the trouble is the setup, not the factoring. </w:t>
       </w:r>
       <w:r>
         <w:rPr>

</xml_diff>